<commit_message>
docs: Update WorkLog week 1
</commit_message>
<xml_diff>
--- a/Work/2022182017_BGC/WorkLog/백경철_작업일지_1주차.docx
+++ b/Work/2022182017_BGC/WorkLog/백경철_작업일지_1주차.docx
@@ -1,6 +1,6 @@
 
 <file path=word/document.xml><?xml version="1.0" encoding="utf-8"?>
-<w:document xmlns:wpc="http://schemas.microsoft.com/office/word/2010/wordprocessingCanvas" xmlns:cx="http://schemas.microsoft.com/office/drawing/2014/chartex" xmlns:cx1="http://schemas.microsoft.com/office/drawing/2015/9/8/chartex" xmlns:mc="http://schemas.openxmlformats.org/markup-compatibility/2006" xmlns:o="urn:schemas-microsoft-com:office:office" xmlns:r="http://schemas.openxmlformats.org/officeDocument/2006/relationships" xmlns:m="http://schemas.openxmlformats.org/officeDocument/2006/math" xmlns:v="urn:schemas-microsoft-com:vml" xmlns:wp14="http://schemas.microsoft.com/office/word/2010/wordprocessingDrawing" xmlns:wp="http://schemas.openxmlformats.org/drawingml/2006/wordprocessingDrawing" xmlns:w10="urn:schemas-microsoft-com:office:word" xmlns:w="http://schemas.openxmlformats.org/wordprocessingml/2006/main" xmlns:w14="http://schemas.microsoft.com/office/word/2010/wordml" xmlns:w15="http://schemas.microsoft.com/office/word/2012/wordml" xmlns:w16se="http://schemas.microsoft.com/office/word/2015/wordml/symex" xmlns:wpg="http://schemas.microsoft.com/office/word/2010/wordprocessingGroup" xmlns:wpi="http://schemas.microsoft.com/office/word/2010/wordprocessingInk" xmlns:wne="http://schemas.microsoft.com/office/word/2006/wordml" xmlns:wps="http://schemas.microsoft.com/office/word/2010/wordprocessingShape" mc:Ignorable="w14 w15 w16se wp14">
+<w:document xmlns:wpc="http://schemas.microsoft.com/office/word/2010/wordprocessingCanvas" xmlns:cx="http://schemas.microsoft.com/office/drawing/2014/chartex" xmlns:cx1="http://schemas.microsoft.com/office/drawing/2015/9/8/chartex" xmlns:cx2="http://schemas.microsoft.com/office/drawing/2015/10/21/chartex" xmlns:cx3="http://schemas.microsoft.com/office/drawing/2016/5/9/chartex" xmlns:cx4="http://schemas.microsoft.com/office/drawing/2016/5/10/chartex" xmlns:cx5="http://schemas.microsoft.com/office/drawing/2016/5/11/chartex" xmlns:cx6="http://schemas.microsoft.com/office/drawing/2016/5/12/chartex" xmlns:cx7="http://schemas.microsoft.com/office/drawing/2016/5/13/chartex" xmlns:cx8="http://schemas.microsoft.com/office/drawing/2016/5/14/chartex" xmlns:mc="http://schemas.openxmlformats.org/markup-compatibility/2006" xmlns:aink="http://schemas.microsoft.com/office/drawing/2016/ink" xmlns:am3d="http://schemas.microsoft.com/office/drawing/2017/model3d" xmlns:o="urn:schemas-microsoft-com:office:office" xmlns:r="http://schemas.openxmlformats.org/officeDocument/2006/relationships" xmlns:m="http://schemas.openxmlformats.org/officeDocument/2006/math" xmlns:v="urn:schemas-microsoft-com:vml" xmlns:wp14="http://schemas.microsoft.com/office/word/2010/wordprocessingDrawing" xmlns:wp="http://schemas.openxmlformats.org/drawingml/2006/wordprocessingDrawing" xmlns:w10="urn:schemas-microsoft-com:office:word" xmlns:w="http://schemas.openxmlformats.org/wordprocessingml/2006/main" xmlns:w14="http://schemas.microsoft.com/office/word/2010/wordml" xmlns:w15="http://schemas.microsoft.com/office/word/2012/wordml" xmlns:w16cex="http://schemas.microsoft.com/office/word/2018/wordml/cex" xmlns:w16cid="http://schemas.microsoft.com/office/word/2016/wordml/cid" xmlns:w16="http://schemas.microsoft.com/office/word/2018/wordml" xmlns:w16sdtdh="http://schemas.microsoft.com/office/word/2020/wordml/sdtdatahash" xmlns:w16se="http://schemas.microsoft.com/office/word/2015/wordml/symex" xmlns:wpg="http://schemas.microsoft.com/office/word/2010/wordprocessingGroup" xmlns:wpi="http://schemas.microsoft.com/office/word/2010/wordprocessingInk" xmlns:wne="http://schemas.microsoft.com/office/word/2006/wordml" xmlns:wps="http://schemas.microsoft.com/office/word/2010/wordprocessingShape" mc:Ignorable="w14 w15 w16se w16cid w16 w16cex w16sdtdh wp14">
   <w:body>
     <w:tbl>
       <w:tblPr>
@@ -52,7 +52,10 @@
           </w:tcPr>
           <w:p>
             <w:r>
-              <w:t>30</w:t>
+              <w:rPr>
+                <w:rFonts w:hint="eastAsia"/>
+              </w:rPr>
+              <w:t>1</w:t>
             </w:r>
             <w:r>
               <w:rPr>
@@ -95,13 +98,22 @@
               <w:t>2</w:t>
             </w:r>
             <w:r>
-              <w:t>025.03</w:t>
+              <w:t>02</w:t>
+            </w:r>
+            <w:r>
+              <w:t>6</w:t>
+            </w:r>
+            <w:r>
+              <w:t>.0</w:t>
+            </w:r>
+            <w:r>
+              <w:t>9</w:t>
             </w:r>
             <w:r>
               <w:t>.</w:t>
             </w:r>
             <w:r>
-              <w:t>24</w:t>
+              <w:t>02</w:t>
             </w:r>
           </w:p>
           <w:p>
@@ -111,10 +123,25 @@
           </w:p>
           <w:p>
             <w:r>
-              <w:t>2025.</w:t>
-            </w:r>
-            <w:r>
-              <w:t>03.30</w:t>
+              <w:t>202</w:t>
+            </w:r>
+            <w:r>
+              <w:t>6</w:t>
+            </w:r>
+            <w:r>
+              <w:t>.</w:t>
+            </w:r>
+            <w:r>
+              <w:t>0</w:t>
+            </w:r>
+            <w:r>
+              <w:t>9</w:t>
+            </w:r>
+            <w:r>
+              <w:t>.</w:t>
+            </w:r>
+            <w:r>
+              <w:t>08</w:t>
             </w:r>
           </w:p>
         </w:tc>
@@ -188,7 +215,16 @@
               <w:t xml:space="preserve">1. </w:t>
             </w:r>
             <w:r>
-              <w:t>캐릭터 완성</w:t>
+              <w:rPr>
+                <w:rFonts w:hint="eastAsia"/>
+              </w:rPr>
+              <w:t xml:space="preserve">팀원과 </w:t>
+            </w:r>
+            <w:r>
+              <w:rPr>
+                <w:rFonts w:hint="eastAsia"/>
+              </w:rPr>
+              <w:t>회의 진행</w:t>
             </w:r>
           </w:p>
           <w:p>
@@ -204,13 +240,46 @@
               <w:t>2</w:t>
             </w:r>
             <w:r>
-              <w:t>. 몬스터</w:t>
-            </w:r>
-            <w:r>
-              <w:rPr>
-                <w:rFonts w:hint="eastAsia"/>
-              </w:rPr>
-              <w:t xml:space="preserve"> 구현</w:t>
+              <w:t xml:space="preserve">. </w:t>
+            </w:r>
+            <w:r>
+              <w:rPr>
+                <w:rFonts w:hint="eastAsia"/>
+              </w:rPr>
+              <w:t xml:space="preserve">언리얼 </w:t>
+            </w:r>
+            <w:r>
+              <w:t xml:space="preserve">5.8 </w:t>
+            </w:r>
+            <w:r>
+              <w:rPr>
+                <w:rFonts w:hint="eastAsia"/>
+              </w:rPr>
+              <w:t xml:space="preserve">버전 </w:t>
+            </w:r>
+            <w:r>
+              <w:t xml:space="preserve">MCP </w:t>
+            </w:r>
+            <w:r>
+              <w:rPr>
+                <w:rFonts w:hint="eastAsia"/>
+              </w:rPr>
+              <w:t xml:space="preserve">와 </w:t>
+            </w:r>
+            <w:r>
+              <w:t xml:space="preserve">Codex </w:t>
+            </w:r>
+            <w:r>
+              <w:rPr>
+                <w:rFonts w:hint="eastAsia"/>
+              </w:rPr>
+              <w:t>연결 시</w:t>
+            </w:r>
+            <w:r>
+              <w:rPr>
+                <w:rFonts w:hint="eastAsia"/>
+              </w:rPr>
+              <w:t>험</w:t>
             </w:r>
           </w:p>
           <w:p>
@@ -218,6 +287,9 @@
               <w:tabs>
                 <w:tab w:val="left" w:pos="2765"/>
               </w:tabs>
+              <w:rPr>
+                <w:rFonts w:hint="eastAsia"/>
+              </w:rPr>
             </w:pPr>
             <w:r>
               <w:rPr>
@@ -226,38 +298,15 @@
               <w:t>3</w:t>
             </w:r>
             <w:r>
-              <w:t>. 버그</w:t>
-            </w:r>
-            <w:r>
-              <w:rPr>
-                <w:rFonts w:hint="eastAsia"/>
-              </w:rPr>
-              <w:t xml:space="preserve"> 수정</w:t>
+              <w:t xml:space="preserve">. </w:t>
+            </w:r>
+            <w:r>
+              <w:rPr>
+                <w:rFonts w:hint="eastAsia"/>
+              </w:rPr>
+              <w:t>언리얼 프로젝트 버그 수정</w:t>
             </w:r>
           </w:p>
-          <w:p>
-            <w:pPr>
-              <w:tabs>
-                <w:tab w:val="left" w:pos="2765"/>
-              </w:tabs>
-            </w:pPr>
-            <w:r>
-              <w:rPr>
-                <w:rFonts w:hint="eastAsia"/>
-              </w:rPr>
-              <w:t>4</w:t>
-            </w:r>
-            <w:r>
-              <w:t>. 리듬</w:t>
-            </w:r>
-            <w:r>
-              <w:rPr>
-                <w:rFonts w:hint="eastAsia"/>
-              </w:rPr>
-              <w:t xml:space="preserve"> 변경 시스템</w:t>
-            </w:r>
-          </w:p>
-          <w:p/>
         </w:tc>
       </w:tr>
     </w:tbl>
@@ -277,9 +326,18 @@
         <w:tabs>
           <w:tab w:val="left" w:pos="2765"/>
         </w:tabs>
-      </w:pPr>
-      <w:r>
-        <w:t>1. 캐릭터 완성</w:t>
+        <w:rPr>
+          <w:rFonts w:hint="eastAsia"/>
+        </w:rPr>
+      </w:pPr>
+      <w:r>
+        <w:t xml:space="preserve">1. </w:t>
+      </w:r>
+      <w:r>
+        <w:rPr>
+          <w:rFonts w:hint="eastAsia"/>
+        </w:rPr>
+        <w:t>팀원과 회의 진행</w:t>
       </w:r>
     </w:p>
     <w:p>
@@ -289,28 +347,19 @@
         </w:tabs>
       </w:pPr>
       <w:r>
-        <w:rPr>
-          <w:rFonts w:hint="eastAsia"/>
-        </w:rPr>
-        <w:t xml:space="preserve"> 캐릭터의 기본 공격</w:t>
-      </w:r>
-      <w:r>
-        <w:t>, 스킬</w:t>
-      </w:r>
-      <w:r>
-        <w:rPr>
-          <w:rFonts w:hint="eastAsia"/>
-        </w:rPr>
-        <w:t>,</w:t>
-      </w:r>
-      <w:r>
-        <w:t xml:space="preserve"> 버프</w:t>
-      </w:r>
-      <w:r>
-        <w:rPr>
-          <w:rFonts w:hint="eastAsia"/>
-        </w:rPr>
-        <w:t xml:space="preserve"> 시스템 등 캐릭터가 기본적으로 가져야 할 기능들 모두 구현</w:t>
+        <w:t>전체적인 마네킹 AI의 행동 및 이동 방식에 대한 회의를 진행함.</w:t>
+      </w:r>
+      <w:r>
+        <w:br/>
+        <w:t xml:space="preserve">마네킹 AI가 무조건적으로 플레이어를 추적하는 방식이 아닌, </w:t>
+      </w:r>
+      <w:proofErr w:type="spellStart"/>
+      <w:r>
+        <w:t>상황별</w:t>
+      </w:r>
+      <w:proofErr w:type="spellEnd"/>
+      <w:r>
+        <w:t xml:space="preserve"> 가중치를 기반으로 행동 및 이동 방향을 결정하는 AI 구조에 대해 논의함.</w:t>
       </w:r>
     </w:p>
     <w:p>
@@ -318,6 +367,9 @@
         <w:tabs>
           <w:tab w:val="left" w:pos="2765"/>
         </w:tabs>
+        <w:rPr>
+          <w:rFonts w:hint="eastAsia"/>
+        </w:rPr>
       </w:pPr>
     </w:p>
     <w:p>
@@ -333,13 +385,40 @@
         <w:t>2</w:t>
       </w:r>
       <w:r>
-        <w:t>. 몬스터</w:t>
-      </w:r>
-      <w:r>
-        <w:rPr>
-          <w:rFonts w:hint="eastAsia"/>
-        </w:rPr>
-        <w:t xml:space="preserve"> 구현</w:t>
+        <w:t xml:space="preserve">. </w:t>
+      </w:r>
+      <w:r>
+        <w:rPr>
+          <w:rFonts w:hint="eastAsia"/>
+        </w:rPr>
+        <w:t xml:space="preserve">언리얼 </w:t>
+      </w:r>
+      <w:r>
+        <w:t xml:space="preserve">5.8 </w:t>
+      </w:r>
+      <w:r>
+        <w:rPr>
+          <w:rFonts w:hint="eastAsia"/>
+        </w:rPr>
+        <w:t xml:space="preserve">버전 </w:t>
+      </w:r>
+      <w:r>
+        <w:t xml:space="preserve">MCP </w:t>
+      </w:r>
+      <w:r>
+        <w:rPr>
+          <w:rFonts w:hint="eastAsia"/>
+        </w:rPr>
+        <w:t xml:space="preserve">와 </w:t>
+      </w:r>
+      <w:r>
+        <w:t xml:space="preserve">Codex </w:t>
+      </w:r>
+      <w:r>
+        <w:rPr>
+          <w:rFonts w:hint="eastAsia"/>
+        </w:rPr>
+        <w:t>연결 시험</w:t>
       </w:r>
     </w:p>
     <w:p>
@@ -349,50 +428,20 @@
         </w:tabs>
       </w:pPr>
       <w:r>
-        <w:rPr>
-          <w:rFonts w:hint="eastAsia"/>
-        </w:rPr>
-        <w:t xml:space="preserve"> 기본 몬스터 한 종류의 공격과</w:t>
-      </w:r>
-      <w:r>
-        <w:t>, 애니메이션</w:t>
-      </w:r>
-      <w:r>
-        <w:rPr>
-          <w:rFonts w:hint="eastAsia"/>
-        </w:rPr>
-        <w:t xml:space="preserve"> </w:t>
-      </w:r>
-      <w:bookmarkStart w:id="0" w:name="_GoBack"/>
-      <w:bookmarkEnd w:id="0"/>
-      <w:r>
-        <w:rPr>
-          <w:rFonts w:hint="eastAsia"/>
-        </w:rPr>
-        <w:t>변경,</w:t>
-      </w:r>
-      <w:r>
-        <w:t xml:space="preserve"> 사망</w:t>
-      </w:r>
-      <w:r>
-        <w:rPr>
-          <w:rFonts w:hint="eastAsia"/>
-        </w:rPr>
-        <w:t xml:space="preserve"> </w:t>
-      </w:r>
-      <w:proofErr w:type="spellStart"/>
-      <w:r>
-        <w:rPr>
-          <w:rFonts w:hint="eastAsia"/>
-        </w:rPr>
-        <w:t>처리등을</w:t>
-      </w:r>
-      <w:proofErr w:type="spellEnd"/>
-      <w:r>
-        <w:rPr>
-          <w:rFonts w:hint="eastAsia"/>
-        </w:rPr>
-        <w:t xml:space="preserve"> 추가</w:t>
+        <w:t>Unreal Engine 5.8 버전에 도입된 Unreal MCP Plugin을 활용하여 MCP 서버를 설정함.</w:t>
+      </w:r>
+      <w:r>
+        <w:br/>
+        <w:t xml:space="preserve">이후 CMD 및 Unreal </w:t>
+      </w:r>
+      <w:r>
+        <w:rPr>
+          <w:rFonts w:hint="eastAsia"/>
+        </w:rPr>
+        <w:t>콘솔</w:t>
+      </w:r>
+      <w:r>
+        <w:t>을 통해 Codex와의 연결을 테스트하고, 간단한 프롬프트를 입력하여 Actor 생성이 정상적으로 이루어지는지 확인함.</w:t>
       </w:r>
     </w:p>
     <w:p>
@@ -407,184 +456,245 @@
         <w:tabs>
           <w:tab w:val="left" w:pos="2765"/>
         </w:tabs>
-      </w:pPr>
-      <w:r>
-        <w:rPr>
-          <w:rFonts w:hint="eastAsia"/>
-        </w:rPr>
-        <w:t>3</w:t>
-      </w:r>
-      <w:r>
-        <w:t>. 버그</w:t>
-      </w:r>
-      <w:r>
-        <w:rPr>
-          <w:rFonts w:hint="eastAsia"/>
-        </w:rPr>
-        <w:t xml:space="preserve"> 수정</w:t>
+        <w:rPr>
+          <w:rFonts w:hint="eastAsia"/>
+        </w:rPr>
+      </w:pPr>
+      <w:r>
+        <w:rPr>
+          <w:noProof/>
+        </w:rPr>
+        <w:drawing>
+          <wp:inline distT="0" distB="0" distL="0" distR="0" wp14:anchorId="7C9EE951" wp14:editId="6A55BA51">
+            <wp:extent cx="5731510" cy="3143885"/>
+            <wp:effectExtent l="0" t="0" r="2540" b="0"/>
+            <wp:docPr id="2" name="그림 2"/>
+            <wp:cNvGraphicFramePr>
+              <a:graphicFrameLocks xmlns:a="http://schemas.openxmlformats.org/drawingml/2006/main" noChangeAspect="1"/>
+            </wp:cNvGraphicFramePr>
+            <a:graphic xmlns:a="http://schemas.openxmlformats.org/drawingml/2006/main">
+              <a:graphicData uri="http://schemas.openxmlformats.org/drawingml/2006/picture">
+                <pic:pic xmlns:pic="http://schemas.openxmlformats.org/drawingml/2006/picture">
+                  <pic:nvPicPr>
+                    <pic:cNvPr id="1" name=""/>
+                    <pic:cNvPicPr/>
+                  </pic:nvPicPr>
+                  <pic:blipFill>
+                    <a:blip r:embed="rId7"/>
+                    <a:stretch>
+                      <a:fillRect/>
+                    </a:stretch>
+                  </pic:blipFill>
+                  <pic:spPr>
+                    <a:xfrm>
+                      <a:off x="0" y="0"/>
+                      <a:ext cx="5731510" cy="3143885"/>
+                    </a:xfrm>
+                    <a:prstGeom prst="rect">
+                      <a:avLst/>
+                    </a:prstGeom>
+                  </pic:spPr>
+                </pic:pic>
+              </a:graphicData>
+            </a:graphic>
+          </wp:inline>
+        </w:drawing>
       </w:r>
     </w:p>
     <w:p>
-      <w:pPr>
-        <w:tabs>
-          <w:tab w:val="left" w:pos="2765"/>
-        </w:tabs>
-      </w:pPr>
-      <w:r>
-        <w:rPr>
-          <w:rFonts w:hint="eastAsia"/>
-        </w:rPr>
-        <w:t xml:space="preserve"> </w:t>
-      </w:r>
-      <w:r>
-        <w:t xml:space="preserve">1) </w:t>
-      </w:r>
-      <w:proofErr w:type="spellStart"/>
-      <w:r>
-        <w:rPr>
-          <w:rFonts w:hint="eastAsia"/>
-        </w:rPr>
-        <w:t>n</w:t>
-      </w:r>
-      <w:r>
-        <w:t>avmesh</w:t>
-      </w:r>
-      <w:proofErr w:type="spellEnd"/>
-      <w:r>
-        <w:t>를</w:t>
-      </w:r>
-      <w:r>
-        <w:rPr>
-          <w:rFonts w:hint="eastAsia"/>
-        </w:rPr>
-        <w:t xml:space="preserve"> 적용하면서 생긴 중력이 적용되지 않던 문제를 해결</w:t>
+      <w:r>
+        <w:rPr>
+          <w:noProof/>
+        </w:rPr>
+        <w:lastRenderedPageBreak/>
+        <w:drawing>
+          <wp:inline distT="0" distB="0" distL="0" distR="0" wp14:anchorId="1AE59119" wp14:editId="236BD3F7">
+            <wp:extent cx="5721350" cy="3117850"/>
+            <wp:effectExtent l="0" t="0" r="0" b="6350"/>
+            <wp:docPr id="1" name="그림 1"/>
+            <wp:cNvGraphicFramePr>
+              <a:graphicFrameLocks xmlns:a="http://schemas.openxmlformats.org/drawingml/2006/main" noChangeAspect="1"/>
+            </wp:cNvGraphicFramePr>
+            <a:graphic xmlns:a="http://schemas.openxmlformats.org/drawingml/2006/main">
+              <a:graphicData uri="http://schemas.openxmlformats.org/drawingml/2006/picture">
+                <pic:pic xmlns:pic="http://schemas.openxmlformats.org/drawingml/2006/picture">
+                  <pic:nvPicPr>
+                    <pic:cNvPr id="0" name="Picture 1"/>
+                    <pic:cNvPicPr>
+                      <a:picLocks noChangeAspect="1" noChangeArrowheads="1"/>
+                    </pic:cNvPicPr>
+                  </pic:nvPicPr>
+                  <pic:blipFill>
+                    <a:blip r:embed="rId8" cstate="print">
+                      <a:extLst>
+                        <a:ext uri="{28A0092B-C50C-407E-A947-70E740481C1C}">
+                          <a14:useLocalDpi xmlns:a14="http://schemas.microsoft.com/office/drawing/2010/main" val="0"/>
+                        </a:ext>
+                      </a:extLst>
+                    </a:blip>
+                    <a:srcRect/>
+                    <a:stretch>
+                      <a:fillRect/>
+                    </a:stretch>
+                  </pic:blipFill>
+                  <pic:spPr bwMode="auto">
+                    <a:xfrm>
+                      <a:off x="0" y="0"/>
+                      <a:ext cx="5721350" cy="3117850"/>
+                    </a:xfrm>
+                    <a:prstGeom prst="rect">
+                      <a:avLst/>
+                    </a:prstGeom>
+                    <a:noFill/>
+                    <a:ln>
+                      <a:noFill/>
+                    </a:ln>
+                  </pic:spPr>
+                </pic:pic>
+              </a:graphicData>
+            </a:graphic>
+          </wp:inline>
+        </w:drawing>
       </w:r>
     </w:p>
     <w:p>
-      <w:pPr>
-        <w:tabs>
-          <w:tab w:val="left" w:pos="2765"/>
-        </w:tabs>
-      </w:pPr>
-      <w:r>
-        <w:rPr>
-          <w:rFonts w:hint="eastAsia"/>
-        </w:rPr>
+      <w:r>
         <w:t xml:space="preserve"> </w:t>
-      </w:r>
-      <w:r>
-        <w:t>2) 1번</w:t>
-      </w:r>
-      <w:r>
-        <w:rPr>
-          <w:rFonts w:hint="eastAsia"/>
-        </w:rPr>
-        <w:t xml:space="preserve"> 문제를 해결하면서 생긴 몬스터의 </w:t>
-      </w:r>
-      <w:r>
-        <w:t>y좌표가</w:t>
-      </w:r>
-      <w:r>
-        <w:rPr>
-          <w:rFonts w:hint="eastAsia"/>
-        </w:rPr>
-        <w:t xml:space="preserve"> </w:t>
-      </w:r>
-      <w:r>
-        <w:t>0으로</w:t>
-      </w:r>
-      <w:r>
-        <w:rPr>
-          <w:rFonts w:hint="eastAsia"/>
-        </w:rPr>
-        <w:t xml:space="preserve"> 변경되는 문제 해결</w:t>
       </w:r>
     </w:p>
     <w:p>
-      <w:pPr>
-        <w:tabs>
-          <w:tab w:val="left" w:pos="2765"/>
-        </w:tabs>
-      </w:pPr>
-      <w:r>
-        <w:rPr>
-          <w:rFonts w:hint="eastAsia"/>
-        </w:rPr>
-        <w:t xml:space="preserve"> </w:t>
-      </w:r>
-      <w:r>
-        <w:t>3) 이동하면서</w:t>
-      </w:r>
-      <w:r>
-        <w:rPr>
-          <w:rFonts w:hint="eastAsia"/>
-        </w:rPr>
-        <w:t xml:space="preserve"> 특정 애니메이션을 진행하면 반복 재생되던 버그 해결</w:t>
+      <w:r>
+        <w:rPr>
+          <w:rFonts w:hint="eastAsia"/>
+        </w:rPr>
+        <w:t>3</w:t>
+      </w:r>
+      <w:r>
+        <w:t xml:space="preserve">. </w:t>
+      </w:r>
+      <w:r>
+        <w:rPr>
+          <w:rFonts w:hint="eastAsia"/>
+        </w:rPr>
+        <w:t>언리얼 프로젝트 버그 수정</w:t>
       </w:r>
     </w:p>
     <w:p>
       <w:pPr>
-        <w:tabs>
-          <w:tab w:val="left" w:pos="2765"/>
-        </w:tabs>
-      </w:pPr>
-    </w:p>
-    <w:p>
-      <w:pPr>
-        <w:tabs>
-          <w:tab w:val="left" w:pos="2765"/>
-        </w:tabs>
-      </w:pPr>
-      <w:r>
-        <w:rPr>
-          <w:rFonts w:hint="eastAsia"/>
-        </w:rPr>
-        <w:t>4</w:t>
-      </w:r>
-      <w:r>
-        <w:t>. 리듬</w:t>
-      </w:r>
-      <w:r>
-        <w:rPr>
-          <w:rFonts w:hint="eastAsia"/>
-        </w:rPr>
-        <w:t xml:space="preserve"> 변경 시스템</w:t>
-      </w:r>
-    </w:p>
-    <w:p>
-      <w:pPr>
-        <w:tabs>
-          <w:tab w:val="left" w:pos="2765"/>
-        </w:tabs>
-      </w:pPr>
-      <w:r>
-        <w:rPr>
-          <w:rFonts w:hint="eastAsia"/>
-        </w:rPr>
-        <w:t xml:space="preserve"> 플레이어가 리듬을 변경하게 된다면 실제로 음악도 변경되도록 함</w:t>
-      </w:r>
-      <w:r>
-        <w:t>, 기존에</w:t>
-      </w:r>
-      <w:r>
-        <w:rPr>
-          <w:rFonts w:hint="eastAsia"/>
-        </w:rPr>
-        <w:t xml:space="preserve"> 서버에서 하던 리듬 변경을 클라이언트에서 진행 후에 변경된 리듬만 서버로 보내 확인 후 변경된 리듬의 버프를 적용하도록 수정</w:t>
+        <w:rPr>
+          <w:rFonts w:hint="eastAsia"/>
+        </w:rPr>
+      </w:pPr>
+      <w:r>
+        <w:rPr>
+          <w:rFonts w:hint="eastAsia"/>
+        </w:rPr>
+        <w:t>에디터 버전 업데이트 이후 플레이어</w:t>
+      </w:r>
+      <w:r>
+        <w:t xml:space="preserve"> </w:t>
+      </w:r>
+      <w:r>
+        <w:rPr>
+          <w:rFonts w:hint="eastAsia"/>
+        </w:rPr>
+        <w:t>이동 및 카메라 회전이 작동하지 않는 문</w:t>
+      </w:r>
+      <w:r>
+        <w:rPr>
+          <w:rFonts w:hint="eastAsia"/>
+        </w:rPr>
+        <w:t>제를 확인하고 수정함</w:t>
+      </w:r>
+      <w:r>
+        <w:t xml:space="preserve">. </w:t>
+      </w:r>
+      <w:r>
+        <w:rPr>
+          <w:rFonts w:hint="eastAsia"/>
+        </w:rPr>
+        <w:t xml:space="preserve">문제 원인으로는 </w:t>
+      </w:r>
+      <w:r>
+        <w:rPr>
+          <w:rFonts w:hint="eastAsia"/>
+        </w:rPr>
+        <w:t xml:space="preserve">버전 업데이트 과정에서 </w:t>
+      </w:r>
+      <w:r>
+        <w:t xml:space="preserve">Input Action </w:t>
+      </w:r>
+      <w:r>
+        <w:rPr>
+          <w:rFonts w:hint="eastAsia"/>
+        </w:rPr>
+        <w:t xml:space="preserve">과 </w:t>
+      </w:r>
+      <w:r>
+        <w:t xml:space="preserve">Input Mapping Context </w:t>
+      </w:r>
+      <w:r>
+        <w:rPr>
+          <w:rFonts w:hint="eastAsia"/>
+        </w:rPr>
+        <w:t>간</w:t>
+      </w:r>
+      <w:r>
+        <w:rPr>
+          <w:rFonts w:hint="eastAsia"/>
+        </w:rPr>
+        <w:t>의</w:t>
+      </w:r>
+      <w:r>
+        <w:rPr>
+          <w:rFonts w:hint="eastAsia"/>
+        </w:rPr>
+        <w:t xml:space="preserve"> 연결이 </w:t>
+      </w:r>
+      <w:r>
+        <w:rPr>
+          <w:rFonts w:hint="eastAsia"/>
+        </w:rPr>
+        <w:t>해제된 것</w:t>
+      </w:r>
+      <w:r>
+        <w:rPr>
+          <w:rFonts w:hint="eastAsia"/>
+        </w:rPr>
+        <w:t>을 확인</w:t>
+      </w:r>
+      <w:r>
+        <w:rPr>
+          <w:rFonts w:hint="eastAsia"/>
+        </w:rPr>
+        <w:t>하였으며</w:t>
+      </w:r>
+      <w:r>
+        <w:t xml:space="preserve">, </w:t>
+      </w:r>
+      <w:r>
+        <w:rPr>
+          <w:rFonts w:hint="eastAsia"/>
+        </w:rPr>
+        <w:t>해당 연결을</w:t>
+      </w:r>
+      <w:r>
+        <w:rPr>
+          <w:rFonts w:hint="eastAsia"/>
+        </w:rPr>
+        <w:t xml:space="preserve"> 복구하여 </w:t>
+      </w:r>
+      <w:r>
+        <w:rPr>
+          <w:rFonts w:hint="eastAsia"/>
+        </w:rPr>
+        <w:t>플레이어 기능이 정상적으로 작동하도록 수정함</w:t>
+      </w:r>
+      <w:r>
+        <w:t>.</w:t>
       </w:r>
     </w:p>
     <w:p/>
-    <w:p>
-      <w:r>
-        <w:rPr>
-          <w:rFonts w:hint="eastAsia"/>
-        </w:rPr>
-        <w:t>진행 상황 유튜브 링크</w:t>
-      </w:r>
-      <w:r>
-        <w:t xml:space="preserve">: </w:t>
-      </w:r>
-    </w:p>
     <w:tbl>
       <w:tblPr>
         <w:tblStyle w:val="1"/>
@@ -615,7 +725,6 @@
                 <w:b/>
                 <w:bCs/>
               </w:rPr>
-              <w:lastRenderedPageBreak/>
               <w:t>문제점 정리</w:t>
             </w:r>
           </w:p>
@@ -686,7 +795,10 @@
           </w:tcPr>
           <w:p>
             <w:r>
-              <w:t>31</w:t>
+              <w:rPr>
+                <w:rFonts w:hint="eastAsia"/>
+              </w:rPr>
+              <w:t>2</w:t>
             </w:r>
             <w:r>
               <w:rPr>
@@ -729,13 +841,22 @@
               <w:t>2</w:t>
             </w:r>
             <w:r>
-              <w:t>025.3</w:t>
+              <w:t>02</w:t>
+            </w:r>
+            <w:r>
+              <w:t>6</w:t>
             </w:r>
             <w:r>
               <w:t>.</w:t>
             </w:r>
             <w:r>
-              <w:t>31</w:t>
+              <w:t>9</w:t>
+            </w:r>
+            <w:r>
+              <w:t>.</w:t>
+            </w:r>
+            <w:r>
+              <w:t>09</w:t>
             </w:r>
             <w:r>
               <w:t xml:space="preserve"> </w:t>
@@ -748,13 +869,22 @@
           </w:p>
           <w:p>
             <w:r>
-              <w:t>2025.4</w:t>
+              <w:t>202</w:t>
+            </w:r>
+            <w:r>
+              <w:t>6</w:t>
             </w:r>
             <w:r>
               <w:t>.</w:t>
             </w:r>
             <w:r>
-              <w:t>06</w:t>
+              <w:t>9</w:t>
+            </w:r>
+            <w:r>
+              <w:t>.</w:t>
+            </w:r>
+            <w:r>
+              <w:t>15</w:t>
             </w:r>
           </w:p>
         </w:tc>
@@ -780,8 +910,18 @@
                 <w:b/>
                 <w:bCs/>
               </w:rPr>
-              <w:t>다음주 할일</w:t>
-            </w:r>
+              <w:t xml:space="preserve">다음주 </w:t>
+            </w:r>
+            <w:proofErr w:type="spellStart"/>
+            <w:r>
+              <w:rPr>
+                <w:rFonts w:hint="eastAsia"/>
+                <w:b/>
+                <w:bCs/>
+              </w:rPr>
+              <w:t>할일</w:t>
+            </w:r>
+            <w:proofErr w:type="spellEnd"/>
           </w:p>
         </w:tc>
         <w:tc>
@@ -805,21 +945,25 @@
               <w:t xml:space="preserve">. </w:t>
             </w:r>
             <w:r>
-              <w:t>중점연구(</w:t>
-            </w:r>
-            <w:proofErr w:type="spellStart"/>
-            <w:r>
-              <w:rPr>
-                <w:rFonts w:hint="eastAsia"/>
-              </w:rPr>
-              <w:t>a</w:t>
-            </w:r>
-            <w:r>
-              <w:t>i</w:t>
-            </w:r>
-            <w:proofErr w:type="spellEnd"/>
-            <w:r>
-              <w:t>) 진행</w:t>
+              <w:rPr>
+                <w:rFonts w:hint="eastAsia"/>
+              </w:rPr>
+              <w:t xml:space="preserve">플레이어의 카메라에 따른 기본적인 </w:t>
+            </w:r>
+            <w:r>
+              <w:rPr>
+                <w:rFonts w:hint="eastAsia"/>
+              </w:rPr>
+              <w:t xml:space="preserve">마네킹 </w:t>
+            </w:r>
+            <w:r>
+              <w:t xml:space="preserve">AI </w:t>
+            </w:r>
+            <w:r>
+              <w:rPr>
+                <w:rFonts w:hint="eastAsia"/>
+              </w:rPr>
+              <w:t>이동 구현</w:t>
             </w:r>
           </w:p>
         </w:tc>
@@ -883,7 +1027,7 @@
     </w:tbl>
     <w:p/>
     <w:sectPr>
-      <w:headerReference w:type="default" r:id="rId7"/>
+      <w:headerReference w:type="default" r:id="rId9"/>
       <w:pgSz w:w="11906" w:h="16838"/>
       <w:pgMar w:top="1701" w:right="1440" w:bottom="1440" w:left="1440" w:header="851" w:footer="992" w:gutter="0"/>
       <w:cols w:space="720"/>
@@ -894,7 +1038,7 @@
 </file>
 
 <file path=word/endnotes.xml><?xml version="1.0" encoding="utf-8"?>
-<w:endnotes xmlns:wpc="http://schemas.microsoft.com/office/word/2010/wordprocessingCanvas" xmlns:cx="http://schemas.microsoft.com/office/drawing/2014/chartex" xmlns:cx1="http://schemas.microsoft.com/office/drawing/2015/9/8/chartex" xmlns:mc="http://schemas.openxmlformats.org/markup-compatibility/2006" xmlns:o="urn:schemas-microsoft-com:office:office" xmlns:r="http://schemas.openxmlformats.org/officeDocument/2006/relationships" xmlns:m="http://schemas.openxmlformats.org/officeDocument/2006/math" xmlns:v="urn:schemas-microsoft-com:vml" xmlns:wp14="http://schemas.microsoft.com/office/word/2010/wordprocessingDrawing" xmlns:wp="http://schemas.openxmlformats.org/drawingml/2006/wordprocessingDrawing" xmlns:w10="urn:schemas-microsoft-com:office:word" xmlns:w="http://schemas.openxmlformats.org/wordprocessingml/2006/main" xmlns:w14="http://schemas.microsoft.com/office/word/2010/wordml" xmlns:w15="http://schemas.microsoft.com/office/word/2012/wordml" xmlns:w16se="http://schemas.microsoft.com/office/word/2015/wordml/symex" xmlns:wpg="http://schemas.microsoft.com/office/word/2010/wordprocessingGroup" xmlns:wpi="http://schemas.microsoft.com/office/word/2010/wordprocessingInk" xmlns:wne="http://schemas.microsoft.com/office/word/2006/wordml" xmlns:wps="http://schemas.microsoft.com/office/word/2010/wordprocessingShape" mc:Ignorable="w14 w15 w16se wp14">
+<w:endnotes xmlns:wpc="http://schemas.microsoft.com/office/word/2010/wordprocessingCanvas" xmlns:cx="http://schemas.microsoft.com/office/drawing/2014/chartex" xmlns:cx1="http://schemas.microsoft.com/office/drawing/2015/9/8/chartex" xmlns:cx2="http://schemas.microsoft.com/office/drawing/2015/10/21/chartex" xmlns:cx3="http://schemas.microsoft.com/office/drawing/2016/5/9/chartex" xmlns:cx4="http://schemas.microsoft.com/office/drawing/2016/5/10/chartex" xmlns:cx5="http://schemas.microsoft.com/office/drawing/2016/5/11/chartex" xmlns:cx6="http://schemas.microsoft.com/office/drawing/2016/5/12/chartex" xmlns:cx7="http://schemas.microsoft.com/office/drawing/2016/5/13/chartex" xmlns:cx8="http://schemas.microsoft.com/office/drawing/2016/5/14/chartex" xmlns:mc="http://schemas.openxmlformats.org/markup-compatibility/2006" xmlns:aink="http://schemas.microsoft.com/office/drawing/2016/ink" xmlns:am3d="http://schemas.microsoft.com/office/drawing/2017/model3d" xmlns:o="urn:schemas-microsoft-com:office:office" xmlns:r="http://schemas.openxmlformats.org/officeDocument/2006/relationships" xmlns:m="http://schemas.openxmlformats.org/officeDocument/2006/math" xmlns:v="urn:schemas-microsoft-com:vml" xmlns:wp14="http://schemas.microsoft.com/office/word/2010/wordprocessingDrawing" xmlns:wp="http://schemas.openxmlformats.org/drawingml/2006/wordprocessingDrawing" xmlns:w10="urn:schemas-microsoft-com:office:word" xmlns:w="http://schemas.openxmlformats.org/wordprocessingml/2006/main" xmlns:w14="http://schemas.microsoft.com/office/word/2010/wordml" xmlns:w15="http://schemas.microsoft.com/office/word/2012/wordml" xmlns:w16cex="http://schemas.microsoft.com/office/word/2018/wordml/cex" xmlns:w16cid="http://schemas.microsoft.com/office/word/2016/wordml/cid" xmlns:w16="http://schemas.microsoft.com/office/word/2018/wordml" xmlns:w16sdtdh="http://schemas.microsoft.com/office/word/2020/wordml/sdtdatahash" xmlns:w16se="http://schemas.microsoft.com/office/word/2015/wordml/symex" xmlns:wpg="http://schemas.microsoft.com/office/word/2010/wordprocessingGroup" xmlns:wpi="http://schemas.microsoft.com/office/word/2010/wordprocessingInk" xmlns:wne="http://schemas.microsoft.com/office/word/2006/wordml" xmlns:wps="http://schemas.microsoft.com/office/word/2010/wordprocessingShape" mc:Ignorable="w14 w15 w16se w16cid w16 w16cex w16sdtdh wp14">
   <w:endnote w:type="separator" w:id="-1">
     <w:p>
       <w:pPr>
@@ -919,7 +1063,7 @@
 </file>
 
 <file path=word/footnotes.xml><?xml version="1.0" encoding="utf-8"?>
-<w:footnotes xmlns:wpc="http://schemas.microsoft.com/office/word/2010/wordprocessingCanvas" xmlns:cx="http://schemas.microsoft.com/office/drawing/2014/chartex" xmlns:cx1="http://schemas.microsoft.com/office/drawing/2015/9/8/chartex" xmlns:mc="http://schemas.openxmlformats.org/markup-compatibility/2006" xmlns:o="urn:schemas-microsoft-com:office:office" xmlns:r="http://schemas.openxmlformats.org/officeDocument/2006/relationships" xmlns:m="http://schemas.openxmlformats.org/officeDocument/2006/math" xmlns:v="urn:schemas-microsoft-com:vml" xmlns:wp14="http://schemas.microsoft.com/office/word/2010/wordprocessingDrawing" xmlns:wp="http://schemas.openxmlformats.org/drawingml/2006/wordprocessingDrawing" xmlns:w10="urn:schemas-microsoft-com:office:word" xmlns:w="http://schemas.openxmlformats.org/wordprocessingml/2006/main" xmlns:w14="http://schemas.microsoft.com/office/word/2010/wordml" xmlns:w15="http://schemas.microsoft.com/office/word/2012/wordml" xmlns:w16se="http://schemas.microsoft.com/office/word/2015/wordml/symex" xmlns:wpg="http://schemas.microsoft.com/office/word/2010/wordprocessingGroup" xmlns:wpi="http://schemas.microsoft.com/office/word/2010/wordprocessingInk" xmlns:wne="http://schemas.microsoft.com/office/word/2006/wordml" xmlns:wps="http://schemas.microsoft.com/office/word/2010/wordprocessingShape" mc:Ignorable="w14 w15 w16se wp14">
+<w:footnotes xmlns:wpc="http://schemas.microsoft.com/office/word/2010/wordprocessingCanvas" xmlns:cx="http://schemas.microsoft.com/office/drawing/2014/chartex" xmlns:cx1="http://schemas.microsoft.com/office/drawing/2015/9/8/chartex" xmlns:cx2="http://schemas.microsoft.com/office/drawing/2015/10/21/chartex" xmlns:cx3="http://schemas.microsoft.com/office/drawing/2016/5/9/chartex" xmlns:cx4="http://schemas.microsoft.com/office/drawing/2016/5/10/chartex" xmlns:cx5="http://schemas.microsoft.com/office/drawing/2016/5/11/chartex" xmlns:cx6="http://schemas.microsoft.com/office/drawing/2016/5/12/chartex" xmlns:cx7="http://schemas.microsoft.com/office/drawing/2016/5/13/chartex" xmlns:cx8="http://schemas.microsoft.com/office/drawing/2016/5/14/chartex" xmlns:mc="http://schemas.openxmlformats.org/markup-compatibility/2006" xmlns:aink="http://schemas.microsoft.com/office/drawing/2016/ink" xmlns:am3d="http://schemas.microsoft.com/office/drawing/2017/model3d" xmlns:o="urn:schemas-microsoft-com:office:office" xmlns:r="http://schemas.openxmlformats.org/officeDocument/2006/relationships" xmlns:m="http://schemas.openxmlformats.org/officeDocument/2006/math" xmlns:v="urn:schemas-microsoft-com:vml" xmlns:wp14="http://schemas.microsoft.com/office/word/2010/wordprocessingDrawing" xmlns:wp="http://schemas.openxmlformats.org/drawingml/2006/wordprocessingDrawing" xmlns:w10="urn:schemas-microsoft-com:office:word" xmlns:w="http://schemas.openxmlformats.org/wordprocessingml/2006/main" xmlns:w14="http://schemas.microsoft.com/office/word/2010/wordml" xmlns:w15="http://schemas.microsoft.com/office/word/2012/wordml" xmlns:w16cex="http://schemas.microsoft.com/office/word/2018/wordml/cex" xmlns:w16cid="http://schemas.microsoft.com/office/word/2016/wordml/cid" xmlns:w16="http://schemas.microsoft.com/office/word/2018/wordml" xmlns:w16sdtdh="http://schemas.microsoft.com/office/word/2020/wordml/sdtdatahash" xmlns:w16se="http://schemas.microsoft.com/office/word/2015/wordml/symex" xmlns:wpg="http://schemas.microsoft.com/office/word/2010/wordprocessingGroup" xmlns:wpi="http://schemas.microsoft.com/office/word/2010/wordprocessingInk" xmlns:wne="http://schemas.microsoft.com/office/word/2006/wordml" xmlns:wps="http://schemas.microsoft.com/office/word/2010/wordprocessingShape" mc:Ignorable="w14 w15 w16se w16cid w16 w16cex w16sdtdh wp14">
   <w:footnote w:type="separator" w:id="-1">
     <w:p>
       <w:pPr>
@@ -944,7 +1088,7 @@
 </file>
 
 <file path=word/header1.xml><?xml version="1.0" encoding="utf-8"?>
-<w:hdr xmlns:wpc="http://schemas.microsoft.com/office/word/2010/wordprocessingCanvas" xmlns:cx="http://schemas.microsoft.com/office/drawing/2014/chartex" xmlns:cx1="http://schemas.microsoft.com/office/drawing/2015/9/8/chartex" xmlns:mc="http://schemas.openxmlformats.org/markup-compatibility/2006" xmlns:o="urn:schemas-microsoft-com:office:office" xmlns:r="http://schemas.openxmlformats.org/officeDocument/2006/relationships" xmlns:m="http://schemas.openxmlformats.org/officeDocument/2006/math" xmlns:v="urn:schemas-microsoft-com:vml" xmlns:wp14="http://schemas.microsoft.com/office/word/2010/wordprocessingDrawing" xmlns:wp="http://schemas.openxmlformats.org/drawingml/2006/wordprocessingDrawing" xmlns:w10="urn:schemas-microsoft-com:office:word" xmlns:w="http://schemas.openxmlformats.org/wordprocessingml/2006/main" xmlns:w14="http://schemas.microsoft.com/office/word/2010/wordml" xmlns:w15="http://schemas.microsoft.com/office/word/2012/wordml" xmlns:w16se="http://schemas.microsoft.com/office/word/2015/wordml/symex" xmlns:wpg="http://schemas.microsoft.com/office/word/2010/wordprocessingGroup" xmlns:wpi="http://schemas.microsoft.com/office/word/2010/wordprocessingInk" xmlns:wne="http://schemas.microsoft.com/office/word/2006/wordml" xmlns:wps="http://schemas.microsoft.com/office/word/2010/wordprocessingShape" mc:Ignorable="w14 w15 w16se wp14">
+<w:hdr xmlns:wpc="http://schemas.microsoft.com/office/word/2010/wordprocessingCanvas" xmlns:cx="http://schemas.microsoft.com/office/drawing/2014/chartex" xmlns:cx1="http://schemas.microsoft.com/office/drawing/2015/9/8/chartex" xmlns:cx2="http://schemas.microsoft.com/office/drawing/2015/10/21/chartex" xmlns:cx3="http://schemas.microsoft.com/office/drawing/2016/5/9/chartex" xmlns:cx4="http://schemas.microsoft.com/office/drawing/2016/5/10/chartex" xmlns:cx5="http://schemas.microsoft.com/office/drawing/2016/5/11/chartex" xmlns:cx6="http://schemas.microsoft.com/office/drawing/2016/5/12/chartex" xmlns:cx7="http://schemas.microsoft.com/office/drawing/2016/5/13/chartex" xmlns:cx8="http://schemas.microsoft.com/office/drawing/2016/5/14/chartex" xmlns:mc="http://schemas.openxmlformats.org/markup-compatibility/2006" xmlns:aink="http://schemas.microsoft.com/office/drawing/2016/ink" xmlns:am3d="http://schemas.microsoft.com/office/drawing/2017/model3d" xmlns:o="urn:schemas-microsoft-com:office:office" xmlns:r="http://schemas.openxmlformats.org/officeDocument/2006/relationships" xmlns:m="http://schemas.openxmlformats.org/officeDocument/2006/math" xmlns:v="urn:schemas-microsoft-com:vml" xmlns:wp14="http://schemas.microsoft.com/office/word/2010/wordprocessingDrawing" xmlns:wp="http://schemas.openxmlformats.org/drawingml/2006/wordprocessingDrawing" xmlns:w10="urn:schemas-microsoft-com:office:word" xmlns:w="http://schemas.openxmlformats.org/wordprocessingml/2006/main" xmlns:w14="http://schemas.microsoft.com/office/word/2010/wordml" xmlns:w15="http://schemas.microsoft.com/office/word/2012/wordml" xmlns:w16cex="http://schemas.microsoft.com/office/word/2018/wordml/cex" xmlns:w16cid="http://schemas.microsoft.com/office/word/2016/wordml/cid" xmlns:w16="http://schemas.microsoft.com/office/word/2018/wordml" xmlns:w16sdtdh="http://schemas.microsoft.com/office/word/2020/wordml/sdtdatahash" xmlns:w16se="http://schemas.microsoft.com/office/word/2015/wordml/symex" xmlns:wpg="http://schemas.microsoft.com/office/word/2010/wordprocessingGroup" xmlns:wpi="http://schemas.microsoft.com/office/word/2010/wordprocessingInk" xmlns:wne="http://schemas.microsoft.com/office/word/2006/wordml" xmlns:wps="http://schemas.microsoft.com/office/word/2010/wordprocessingShape" mc:Ignorable="w14 w15 w16se w16cid w16 w16cex w16sdtdh wp14">
   <w:p>
     <w:pPr>
       <w:pStyle w:val="a3"/>
@@ -959,32 +1103,46 @@
     <w:pPr>
       <w:pStyle w:val="a3"/>
       <w:rPr>
+        <w:b/>
+        <w:bCs/>
+      </w:rPr>
+    </w:pPr>
+    <w:r>
+      <w:rPr>
         <w:rFonts w:hint="eastAsia"/>
         <w:b/>
         <w:bCs/>
       </w:rPr>
-    </w:pPr>
+      <w:t>작성자(학번 이름</w:t>
+    </w:r>
+    <w:r>
+      <w:rPr>
+        <w:b/>
+        <w:bCs/>
+      </w:rPr>
+      <w:t xml:space="preserve">): </w:t>
+    </w:r>
+    <w:r>
+      <w:rPr>
+        <w:b/>
+        <w:bCs/>
+      </w:rPr>
+      <w:t xml:space="preserve"> </w:t>
+    </w:r>
+    <w:r>
+      <w:rPr>
+        <w:b/>
+        <w:bCs/>
+      </w:rPr>
+      <w:t xml:space="preserve">2022182017 </w:t>
+    </w:r>
     <w:r>
       <w:rPr>
         <w:rFonts w:hint="eastAsia"/>
         <w:b/>
         <w:bCs/>
       </w:rPr>
-      <w:t>작성자(학번 이름</w:t>
-    </w:r>
-    <w:r>
-      <w:rPr>
-        <w:b/>
-        <w:bCs/>
-      </w:rPr>
-      <w:t xml:space="preserve">): </w:t>
-    </w:r>
-    <w:r>
-      <w:rPr>
-        <w:b/>
-        <w:bCs/>
-      </w:rPr>
-      <w:t xml:space="preserve"> </w:t>
+      <w:t>백경철</w:t>
     </w:r>
   </w:p>
   <w:p>
@@ -1019,13 +1177,20 @@
         <w:bCs/>
       </w:rPr>
       <w:t xml:space="preserve"> </w:t>
+    </w:r>
+    <w:r>
+      <w:rPr>
+        <w:b/>
+        <w:bCs/>
+      </w:rPr>
+      <w:t>DSFD</w:t>
     </w:r>
   </w:p>
 </w:hdr>
 </file>
 
 <file path=word/numbering.xml><?xml version="1.0" encoding="utf-8"?>
-<w:numbering xmlns:wpc="http://schemas.microsoft.com/office/word/2010/wordprocessingCanvas" xmlns:cx="http://schemas.microsoft.com/office/drawing/2014/chartex" xmlns:cx1="http://schemas.microsoft.com/office/drawing/2015/9/8/chartex" xmlns:mc="http://schemas.openxmlformats.org/markup-compatibility/2006" xmlns:o="urn:schemas-microsoft-com:office:office" xmlns:r="http://schemas.openxmlformats.org/officeDocument/2006/relationships" xmlns:m="http://schemas.openxmlformats.org/officeDocument/2006/math" xmlns:v="urn:schemas-microsoft-com:vml" xmlns:wp14="http://schemas.microsoft.com/office/word/2010/wordprocessingDrawing" xmlns:wp="http://schemas.openxmlformats.org/drawingml/2006/wordprocessingDrawing" xmlns:w10="urn:schemas-microsoft-com:office:word" xmlns:w="http://schemas.openxmlformats.org/wordprocessingml/2006/main" xmlns:w14="http://schemas.microsoft.com/office/word/2010/wordml" xmlns:w15="http://schemas.microsoft.com/office/word/2012/wordml" xmlns:w16se="http://schemas.microsoft.com/office/word/2015/wordml/symex" xmlns:wpg="http://schemas.microsoft.com/office/word/2010/wordprocessingGroup" xmlns:wpi="http://schemas.microsoft.com/office/word/2010/wordprocessingInk" xmlns:wne="http://schemas.microsoft.com/office/word/2006/wordml" xmlns:wps="http://schemas.microsoft.com/office/word/2010/wordprocessingShape" mc:Ignorable="w14 w15 w16se wp14">
+<w:numbering xmlns:wpc="http://schemas.microsoft.com/office/word/2010/wordprocessingCanvas" xmlns:cx="http://schemas.microsoft.com/office/drawing/2014/chartex" xmlns:cx1="http://schemas.microsoft.com/office/drawing/2015/9/8/chartex" xmlns:cx2="http://schemas.microsoft.com/office/drawing/2015/10/21/chartex" xmlns:cx3="http://schemas.microsoft.com/office/drawing/2016/5/9/chartex" xmlns:cx4="http://schemas.microsoft.com/office/drawing/2016/5/10/chartex" xmlns:cx5="http://schemas.microsoft.com/office/drawing/2016/5/11/chartex" xmlns:cx6="http://schemas.microsoft.com/office/drawing/2016/5/12/chartex" xmlns:cx7="http://schemas.microsoft.com/office/drawing/2016/5/13/chartex" xmlns:cx8="http://schemas.microsoft.com/office/drawing/2016/5/14/chartex" xmlns:mc="http://schemas.openxmlformats.org/markup-compatibility/2006" xmlns:aink="http://schemas.microsoft.com/office/drawing/2016/ink" xmlns:am3d="http://schemas.microsoft.com/office/drawing/2017/model3d" xmlns:o="urn:schemas-microsoft-com:office:office" xmlns:r="http://schemas.openxmlformats.org/officeDocument/2006/relationships" xmlns:m="http://schemas.openxmlformats.org/officeDocument/2006/math" xmlns:v="urn:schemas-microsoft-com:vml" xmlns:wp14="http://schemas.microsoft.com/office/word/2010/wordprocessingDrawing" xmlns:wp="http://schemas.openxmlformats.org/drawingml/2006/wordprocessingDrawing" xmlns:w10="urn:schemas-microsoft-com:office:word" xmlns:w="http://schemas.openxmlformats.org/wordprocessingml/2006/main" xmlns:w14="http://schemas.microsoft.com/office/word/2010/wordml" xmlns:w15="http://schemas.microsoft.com/office/word/2012/wordml" xmlns:w16cex="http://schemas.microsoft.com/office/word/2018/wordml/cex" xmlns:w16cid="http://schemas.microsoft.com/office/word/2016/wordml/cid" xmlns:w16="http://schemas.microsoft.com/office/word/2018/wordml" xmlns:w16sdtdh="http://schemas.microsoft.com/office/word/2020/wordml/sdtdatahash" xmlns:w16se="http://schemas.microsoft.com/office/word/2015/wordml/symex" xmlns:wpg="http://schemas.microsoft.com/office/word/2010/wordprocessingGroup" xmlns:wpi="http://schemas.microsoft.com/office/word/2010/wordprocessingInk" xmlns:wne="http://schemas.microsoft.com/office/word/2006/wordml" xmlns:wps="http://schemas.microsoft.com/office/word/2010/wordprocessingShape" mc:Ignorable="w14 w15 w16se w16cid w16 w16cex w16sdtdh wp14">
   <w:abstractNum w:abstractNumId="0" w15:restartNumberingAfterBreak="0">
     <w:nsid w:val="40F07EE4"/>
     <w:multiLevelType w:val="hybridMultilevel"/>
@@ -1610,7 +1775,7 @@
 </file>
 
 <file path=word/styles.xml><?xml version="1.0" encoding="utf-8"?>
-<w:styles xmlns:mc="http://schemas.openxmlformats.org/markup-compatibility/2006" xmlns:r="http://schemas.openxmlformats.org/officeDocument/2006/relationships" xmlns:w="http://schemas.openxmlformats.org/wordprocessingml/2006/main" xmlns:w14="http://schemas.microsoft.com/office/word/2010/wordml" xmlns:w15="http://schemas.microsoft.com/office/word/2012/wordml" xmlns:w16se="http://schemas.microsoft.com/office/word/2015/wordml/symex" mc:Ignorable="w14 w15 w16se">
+<w:styles xmlns:mc="http://schemas.openxmlformats.org/markup-compatibility/2006" xmlns:r="http://schemas.openxmlformats.org/officeDocument/2006/relationships" xmlns:w="http://schemas.openxmlformats.org/wordprocessingml/2006/main" xmlns:w14="http://schemas.microsoft.com/office/word/2010/wordml" xmlns:w15="http://schemas.microsoft.com/office/word/2012/wordml" xmlns:w16cex="http://schemas.microsoft.com/office/word/2018/wordml/cex" xmlns:w16cid="http://schemas.microsoft.com/office/word/2016/wordml/cid" xmlns:w16="http://schemas.microsoft.com/office/word/2018/wordml" xmlns:w16sdtdh="http://schemas.microsoft.com/office/word/2020/wordml/sdtdatahash" xmlns:w16se="http://schemas.microsoft.com/office/word/2015/wordml/symex" mc:Ignorable="w14 w15 w16se w16cid w16 w16cex w16sdtdh">
   <w:docDefaults>
     <w:rPrDefault>
       <w:rPr>
@@ -1627,7 +1792,7 @@
       </w:pPr>
     </w:pPrDefault>
   </w:docDefaults>
-  <w:latentStyles w:defLockedState="0" w:defUIPriority="0" w:defSemiHidden="0" w:defUnhideWhenUsed="0" w:defQFormat="0" w:count="371">
+  <w:latentStyles w:defLockedState="0" w:defUIPriority="0" w:defSemiHidden="0" w:defUnhideWhenUsed="0" w:defQFormat="0" w:count="376">
     <w:lsdException w:name="Normal" w:qFormat="1"/>
     <w:lsdException w:name="heading 1" w:uiPriority="9" w:qFormat="1"/>
     <w:lsdException w:name="heading 2" w:semiHidden="1" w:uiPriority="9" w:unhideWhenUsed="1" w:qFormat="1"/>
@@ -1894,6 +2059,11 @@
     <w:lsdException w:name="Book Title" w:qFormat="1"/>
     <w:lsdException w:name="Bibliography" w:semiHidden="1" w:unhideWhenUsed="1"/>
     <w:lsdException w:name="TOC Heading" w:semiHidden="1" w:unhideWhenUsed="1" w:qFormat="1"/>
+    <w:lsdException w:name="Mention" w:semiHidden="1" w:uiPriority="99" w:unhideWhenUsed="1"/>
+    <w:lsdException w:name="Smart Hyperlink" w:semiHidden="1" w:uiPriority="99" w:unhideWhenUsed="1"/>
+    <w:lsdException w:name="Hashtag" w:semiHidden="1" w:uiPriority="99" w:unhideWhenUsed="1"/>
+    <w:lsdException w:name="Unresolved Mention" w:semiHidden="1" w:uiPriority="99" w:unhideWhenUsed="1"/>
+    <w:lsdException w:name="Smart Link" w:semiHidden="1" w:uiPriority="99" w:unhideWhenUsed="1"/>
   </w:latentStyles>
   <w:style w:type="paragraph" w:default="1" w:styleId="a">
     <w:name w:val="Normal"/>

</xml_diff>